<commit_message>
Update Assignment 3 report with GitHub repo link
</commit_message>
<xml_diff>
--- a/Assignment3/Assignment3_Report_AbdulRehman.docx
+++ b/Assignment3/Assignment3_Report_AbdulRehman.docx
@@ -327,6 +327,21 @@
           <w:sz w:val="22"/>
         </w:rPr>
         <w:t>DefendX successfully combines direct network scanning with dynamic firewall rule visual testing to provide a fully self-contained security simulator. The tool accurately illustrates rule chains and prioritizations, helping students understand defensive network design principles.</w:t>
+      </w:r>
+    </w:p>
+    <w:p/>
+    <w:p>
+      <w:r>
+        <w:rPr>
+          <w:b/>
+        </w:rPr>
+        <w:t xml:space="preserve">GitHub Repository: </w:t>
+      </w:r>
+      <w:r>
+        <w:rPr>
+          <w:color w:val="1976D2"/>
+        </w:rPr>
+        <w:t>https://github.com/muhaddasgujjar/CLO4-IDS-ML-Solution/tree/main/Assignment3</w:t>
       </w:r>
     </w:p>
     <w:sectPr>

</xml_diff>